<commit_message>
docs: blog-7 draft-review — correction block for homepage +18% widget
Adding green "Correction" block at top of draft-review doc acknowledging
GetCito was right about the live homepage Revenue Intelligence card
still displaying +18% (split-string literal in Features.jsx that the
v2-feedback grep missed). Documents the 10acfa0 fix + dist build
verification.

Co-Authored-By: Claude Opus 4.7 <noreply@anthropic.com>
</commit_message>
<xml_diff>
--- a/docs/blog-7-draft-review.docx
+++ b/docs/blog-7-draft-review.docx
@@ -279,6 +279,338 @@
           <w:sz w:val="22"/>
         </w:rPr>
         <w:t xml:space="preserve"> (cluster numbering — Option A vs B) at the top of the doc that needs Aaron's call. See §"GetCito's numbering question" below.</w:t>
+      </w:r>
+    </w:p>
+    <w:p/>
+    <w:p>
+      <w:pPr>
+        <w:shd w:val="clear" w:color="auto" w:fill="F0FFF5"/>
+        <w:pBdr>
+          <w:left w:val="single" w:sz="24" w:space="8" w:color="0A7A3C"/>
+        </w:pBdr>
+      </w:pPr>
+      <w:r>
+        <w:rPr>
+          <w:b/>
+          <w:color w:val="0A4F25"/>
+          <w:sz w:val="18"/>
+        </w:rPr>
+        <w:t>CORRECTION — HOMEPAGE +18% WIDGET WAS A REAL ISSUE (GETCITO WAS RIGHT)</w:t>
+      </w:r>
+    </w:p>
+    <w:p>
+      <w:pPr>
+        <w:shd w:val="clear" w:color="auto" w:fill="F0FFF5"/>
+        <w:pBdr>
+          <w:left w:val="single" w:sz="24" w:space="8" w:color="0A7A3C"/>
+        </w:pBdr>
+      </w:pPr>
+      <w:r>
+        <w:rPr>
+          <w:color w:val="0A7A3C"/>
+          <w:sz w:val="22"/>
+        </w:rPr>
+        <w:t xml:space="preserve">In the v2 outline-feedback doc I told the team this was a "false flag" after a </w:t>
+      </w:r>
+      <w:r>
+        <w:rPr>
+          <w:rFonts w:ascii="Menlo" w:hAnsi="Menlo"/>
+          <w:color w:val="0A7A3C"/>
+          <w:sz w:val="20"/>
+        </w:rPr>
+        <w:t>grep -rniE "\\+?18%"</w:t>
+      </w:r>
+      <w:r>
+        <w:rPr>
+          <w:color w:val="0A7A3C"/>
+          <w:sz w:val="22"/>
+        </w:rPr>
+        <w:t xml:space="preserve"> sweep of </w:t>
+      </w:r>
+      <w:r>
+        <w:rPr>
+          <w:rFonts w:ascii="Menlo" w:hAnsi="Menlo"/>
+          <w:color w:val="0A7A3C"/>
+          <w:sz w:val="20"/>
+        </w:rPr>
+        <w:t>src/</w:t>
+      </w:r>
+      <w:r>
+        <w:rPr>
+          <w:color w:val="0A7A3C"/>
+          <w:sz w:val="22"/>
+        </w:rPr>
+        <w:t xml:space="preserve"> turned up only legitimate references (Blog 4 cold open, pillar's Maryssa Payne stat, comp set guide's discipline metric). </w:t>
+      </w:r>
+      <w:r>
+        <w:rPr>
+          <w:b/>
+          <w:color w:val="0A7A3C"/>
+          <w:sz w:val="22"/>
+        </w:rPr>
+        <w:t>I was wrong.</w:t>
+      </w:r>
+    </w:p>
+    <w:p>
+      <w:pPr>
+        <w:shd w:val="clear" w:color="auto" w:fill="F0FFF5"/>
+        <w:pBdr>
+          <w:left w:val="single" w:sz="24" w:space="8" w:color="0A7A3C"/>
+        </w:pBdr>
+      </w:pPr>
+      <w:r>
+        <w:rPr>
+          <w:color w:val="0A7A3C"/>
+          <w:sz w:val="22"/>
+        </w:rPr>
+        <w:t xml:space="preserve">The +18% lived in </w:t>
+      </w:r>
+      <w:r>
+        <w:rPr>
+          <w:rFonts w:ascii="Menlo" w:hAnsi="Menlo"/>
+          <w:color w:val="0A7A3C"/>
+          <w:sz w:val="20"/>
+        </w:rPr>
+        <w:t>src/components/Features.jsx:14</w:t>
+      </w:r>
+      <w:r>
+        <w:rPr>
+          <w:color w:val="0A7A3C"/>
+          <w:sz w:val="22"/>
+        </w:rPr>
+        <w:t xml:space="preserve"> as a split string: </w:t>
+      </w:r>
+      <w:r>
+        <w:rPr>
+          <w:rFonts w:ascii="Menlo" w:hAnsi="Menlo"/>
+          <w:color w:val="0A7A3C"/>
+          <w:sz w:val="20"/>
+        </w:rPr>
+        <w:t>value: '+18'</w:t>
+      </w:r>
+      <w:r>
+        <w:rPr>
+          <w:color w:val="0A7A3C"/>
+          <w:sz w:val="22"/>
+        </w:rPr>
+        <w:t xml:space="preserve"> + </w:t>
+      </w:r>
+      <w:r>
+        <w:rPr>
+          <w:rFonts w:ascii="Menlo" w:hAnsi="Menlo"/>
+          <w:color w:val="0A7A3C"/>
+          <w:sz w:val="20"/>
+        </w:rPr>
+        <w:t>suffix: '%'</w:t>
+      </w:r>
+      <w:r>
+        <w:rPr>
+          <w:color w:val="0A7A3C"/>
+          <w:sz w:val="22"/>
+        </w:rPr>
+        <w:t>. Concatenated only at React render time, never both in the same source line, so the regex missed it. The screenshot GetCito shared (Revenue Intelligence card on the live homepage) showed the rendered output.</w:t>
+      </w:r>
+    </w:p>
+    <w:p>
+      <w:pPr>
+        <w:shd w:val="clear" w:color="auto" w:fill="F0FFF5"/>
+        <w:pBdr>
+          <w:left w:val="single" w:sz="24" w:space="8" w:color="0A7A3C"/>
+        </w:pBdr>
+      </w:pPr>
+      <w:r>
+        <w:rPr>
+          <w:b/>
+          <w:color w:val="0A7A3C"/>
+          <w:sz w:val="22"/>
+        </w:rPr>
+        <w:t xml:space="preserve">Fix committed to staging branch </w:t>
+      </w:r>
+      <w:r>
+        <w:rPr>
+          <w:rFonts w:ascii="Menlo" w:hAnsi="Menlo"/>
+          <w:b/>
+          <w:color w:val="0A7A3C"/>
+          <w:sz w:val="20"/>
+        </w:rPr>
+        <w:t>fifa-post-staging-2026-05-22</w:t>
+      </w:r>
+      <w:r>
+        <w:rPr>
+          <w:b/>
+          <w:color w:val="0A7A3C"/>
+          <w:sz w:val="22"/>
+        </w:rPr>
+        <w:t xml:space="preserve"> (commit 10acfa0):</w:t>
+      </w:r>
+    </w:p>
+    <w:p>
+      <w:pPr>
+        <w:pStyle w:val="ListBullet"/>
+      </w:pPr>
+      <w:r>
+        <w:rPr>
+          <w:color w:val="0A7A3C"/>
+          <w:sz w:val="22"/>
+        </w:rPr>
+        <w:t xml:space="preserve">Features.jsx now imports </w:t>
+      </w:r>
+      <w:r>
+        <w:rPr>
+          <w:rFonts w:ascii="Menlo" w:hAnsi="Menlo"/>
+          <w:color w:val="0A7A3C"/>
+          <w:sz w:val="20"/>
+        </w:rPr>
+        <w:t>PORTFOLIO_STATS</w:t>
+      </w:r>
+      <w:r>
+        <w:rPr>
+          <w:color w:val="0A7A3C"/>
+          <w:sz w:val="22"/>
+        </w:rPr>
+        <w:t xml:space="preserve"> from </w:t>
+      </w:r>
+      <w:r>
+        <w:rPr>
+          <w:rFonts w:ascii="Menlo" w:hAnsi="Menlo"/>
+          <w:color w:val="0A7A3C"/>
+          <w:sz w:val="20"/>
+        </w:rPr>
+        <w:t>src/data/portfolio-stats.ts</w:t>
+      </w:r>
+    </w:p>
+    <w:p>
+      <w:pPr>
+        <w:pStyle w:val="ListBullet"/>
+      </w:pPr>
+      <w:r>
+        <w:rPr>
+          <w:color w:val="0A7A3C"/>
+          <w:sz w:val="22"/>
+        </w:rPr>
+        <w:t xml:space="preserve">Hardcoded </w:t>
+      </w:r>
+      <w:r>
+        <w:rPr>
+          <w:rFonts w:ascii="Menlo" w:hAnsi="Menlo"/>
+          <w:color w:val="0A7A3C"/>
+          <w:sz w:val="20"/>
+        </w:rPr>
+        <w:t>'+18'</w:t>
+      </w:r>
+      <w:r>
+        <w:rPr>
+          <w:color w:val="0A7A3C"/>
+          <w:sz w:val="22"/>
+        </w:rPr>
+        <w:t xml:space="preserve"> → </w:t>
+      </w:r>
+      <w:r>
+        <w:rPr>
+          <w:rFonts w:ascii="Menlo" w:hAnsi="Menlo"/>
+          <w:color w:val="0A7A3C"/>
+          <w:sz w:val="20"/>
+        </w:rPr>
+        <w:t>` +${PORTFOLIO_STATS.revparLiftPct}`</w:t>
+      </w:r>
+      <w:r>
+        <w:rPr>
+          <w:color w:val="0A7A3C"/>
+          <w:sz w:val="22"/>
+        </w:rPr>
+        <w:t xml:space="preserve"> — tracks the SSOT automatically on future refreshes</w:t>
+      </w:r>
+    </w:p>
+    <w:p>
+      <w:pPr>
+        <w:pStyle w:val="ListBullet"/>
+      </w:pPr>
+      <w:r>
+        <w:rPr>
+          <w:color w:val="0A7A3C"/>
+          <w:sz w:val="22"/>
+        </w:rPr>
+        <w:t xml:space="preserve">Build verified: </w:t>
+      </w:r>
+      <w:r>
+        <w:rPr>
+          <w:rFonts w:ascii="Menlo" w:hAnsi="Menlo"/>
+          <w:color w:val="0A7A3C"/>
+          <w:sz w:val="20"/>
+        </w:rPr>
+        <w:t>+24%</w:t>
+      </w:r>
+      <w:r>
+        <w:rPr>
+          <w:color w:val="0A7A3C"/>
+          <w:sz w:val="22"/>
+        </w:rPr>
+        <w:t xml:space="preserve"> now appears in </w:t>
+      </w:r>
+      <w:r>
+        <w:rPr>
+          <w:rFonts w:ascii="Menlo" w:hAnsi="Menlo"/>
+          <w:color w:val="0A7A3C"/>
+          <w:sz w:val="20"/>
+        </w:rPr>
+        <w:t>dist/</w:t>
+      </w:r>
+      <w:r>
+        <w:rPr>
+          <w:color w:val="0A7A3C"/>
+          <w:sz w:val="22"/>
+        </w:rPr>
+        <w:t xml:space="preserve"> output; </w:t>
+      </w:r>
+      <w:r>
+        <w:rPr>
+          <w:rFonts w:ascii="Menlo" w:hAnsi="Menlo"/>
+          <w:color w:val="0A7A3C"/>
+          <w:sz w:val="20"/>
+        </w:rPr>
+        <w:t>+18%</w:t>
+      </w:r>
+      <w:r>
+        <w:rPr>
+          <w:color w:val="0A7A3C"/>
+          <w:sz w:val="22"/>
+        </w:rPr>
+        <w:t xml:space="preserve"> gone</w:t>
+      </w:r>
+    </w:p>
+    <w:p>
+      <w:pPr>
+        <w:pStyle w:val="ListBullet"/>
+      </w:pPr>
+      <w:r>
+        <w:rPr>
+          <w:color w:val="0A7A3C"/>
+          <w:sz w:val="22"/>
+        </w:rPr>
+        <w:t>Full site sweep confirmed: this was the only stale +18% reference anywhere in the codebase</w:t>
+      </w:r>
+    </w:p>
+    <w:p>
+      <w:pPr>
+        <w:shd w:val="clear" w:color="auto" w:fill="F0FFF5"/>
+        <w:pBdr>
+          <w:left w:val="single" w:sz="24" w:space="8" w:color="0A7A3C"/>
+        </w:pBdr>
+      </w:pPr>
+      <w:r>
+        <w:rPr>
+          <w:b/>
+          <w:color w:val="0A7A3C"/>
+          <w:sz w:val="22"/>
+        </w:rPr>
+        <w:t>Live homepage won't update until staging branch merges to main</w:t>
+      </w:r>
+      <w:r>
+        <w:rPr>
+          <w:color w:val="0A7A3C"/>
+          <w:sz w:val="22"/>
+        </w:rPr>
+        <w:t xml:space="preserve"> — Aaron's call on timing (see chat).</w:t>
       </w:r>
     </w:p>
     <w:p/>

</xml_diff>